<commit_message>
Fix KDP margin errors; richer back cover with author bio (LL.B., LL.M.)
- Interior: strip the book emoji from the print build only; it has no glyph in
  the print fonts and WeasyPrint dropped it outside the margin on pages 158/190,
  which KDP flagged. Word docs and EPUB keep the emoji. Page count stays 196.
- Back cover redesigned: tagline, blurb, 'Inside you'll meet' bullets, closing
  line, and an About-the-Author block (Frank Alfano, LL.B., LL.M. +
  frankalfano.ca) with a slot for the author photo (cover/author-photo.jpg)
  when it is added. Barcode zone kept clear.
- About the Author in the back matter updated to match; EPUB and backmatter
  docx rebuilt. build.sh now encodes the full pipeline.
</commit_message>
<xml_diff>
--- a/book/word/Back Matter (closing note, method, acknowledgments, author).docx
+++ b/book/word/Back Matter (closing note, method, acknowledgments, author).docx
@@ -443,19 +443,25 @@
         <w:pStyle w:val="FirstParagraph"/>
       </w:pPr>
       <w:r>
-        <w:t xml:space="preserve">Frank Alfano is a writer with a long-standing interest in how the law actually</w:t>
-      </w:r>
-      <w:r>
-        <w:t xml:space="preserve"> </w:t>
-      </w:r>
-      <w:r>
-        <w:t xml:space="preserve">works, in the gap between how crimes are solved on a screen and how they are solved</w:t>
-      </w:r>
-      <w:r>
-        <w:t xml:space="preserve"> </w:t>
-      </w:r>
-      <w:r>
-        <w:t xml:space="preserve">on the record.</w:t>
+        <w:t xml:space="preserve">Frank Alfano, LL.B., LL.M., writes about the law the way it actually works: on the</w:t>
+      </w:r>
+      <w:r>
+        <w:t xml:space="preserve"> </w:t>
+      </w:r>
+      <w:r>
+        <w:t xml:space="preserve">record, one case at a time. Trained in the law, he built this book the way a lawyer</w:t>
+      </w:r>
+      <w:r>
+        <w:t xml:space="preserve"> </w:t>
+      </w:r>
+      <w:r>
+        <w:t xml:space="preserve">builds a case, every chapter anchored to an appellate court decision the reader can</w:t>
+      </w:r>
+      <w:r>
+        <w:t xml:space="preserve"> </w:t>
+      </w:r>
+      <w:r>
+        <w:t xml:space="preserve">look up and verify.</w:t>
       </w:r>
       <w:r>
         <w:t xml:space="preserve"> </w:t>
@@ -479,25 +485,7 @@
         <w:pStyle w:val="BodyText"/>
       </w:pPr>
       <w:r>
-        <w:rPr>
-          <w:iCs/>
-          <w:i/>
-        </w:rPr>
-        <w:t xml:space="preserve">[Author bio to be completed: a sentence or two on background, where you live, and</w:t>
-      </w:r>
-      <w:r>
-        <w:rPr>
-          <w:iCs/>
-          <w:i/>
-        </w:rPr>
-        <w:t xml:space="preserve"> </w:t>
-      </w:r>
-      <w:r>
-        <w:rPr>
-          <w:iCs/>
-          <w:i/>
-        </w:rPr>
-        <w:t xml:space="preserve">anything else you would like readers to know.]</w:t>
+        <w:t xml:space="preserve">Find him at frankalfano.ca.</w:t>
       </w:r>
     </w:p>
     <w:bookmarkEnd w:id="23"/>

</xml_diff>